<commit_message>
Tune briefs for the concept engine and storyboards
- Customer assumptions vs reality is now a main question (was optional)
- Talent look (age, hair, build, usual outfit) for storyboard frames
- "What's something only you have?" plus "what are you sick of seeing"
- Marketing: on-camera comfort column for each team member
- Creators: how you talk on camera, your signature thing, what you sell
- Personalised shoots: voice, assumptions, signature detail, ad rules

Co-Authored-By: Claude Opus 5.5 <noreply@anthropic.com>
Claude-Session: https://claude.ai/code/session_01Ekm7mBGBy9a1vDE3KYrxvW
</commit_message>
<xml_diff>
--- a/dist/word/ASAP Creator Brief.docx
+++ b/dist/word/ASAP Creator Brief.docx
@@ -1750,6 +1750,649 @@
     <w:p>
       <w:pPr>
         <w:keepNext/>
+        <w:spacing w:after="60" w:before="280"/>
+      </w:pPr>
+      <w:r>
+        <w:rPr>
+          <w:rFonts w:ascii="Arial" w:cs="Arial" w:eastAsia="Arial" w:hAnsi="Arial"/>
+          <w:b/>
+          <w:bCs/>
+          <w:sz w:val="22"/>
+          <w:szCs w:val="22"/>
+        </w:rPr>
+        <w:t xml:space="preserve">5.  </w:t>
+      </w:r>
+      <w:r>
+        <w:rPr>
+          <w:rFonts w:ascii="Arial" w:cs="Arial" w:eastAsia="Arial" w:hAnsi="Arial"/>
+          <w:b/>
+          <w:bCs/>
+          <w:sz w:val="22"/>
+          <w:szCs w:val="22"/>
+        </w:rPr>
+        <w:t xml:space="preserve">Anything you sell or promote?</w:t>
+      </w:r>
+    </w:p>
+    <w:p>
+      <w:pPr>
+        <w:keepNext/>
+        <w:spacing w:after="80" w:before="0"/>
+      </w:pPr>
+      <w:r>
+        <w:rPr>
+          <w:rFonts w:ascii="Arial" w:cs="Arial" w:eastAsia="Arial" w:hAnsi="Arial"/>
+          <w:color w:val="6F6F6F"/>
+          <w:sz w:val="19"/>
+          <w:szCs w:val="19"/>
+        </w:rPr>
+        <w:t xml:space="preserve">Your own products, affiliate codes, brand partners. Real prices and codes only. We never make one up. Nothing yet? Just skip.</w:t>
+      </w:r>
+    </w:p>
+    <w:tbl>
+      <w:tblPr>
+        <w:tblW w:type="dxa" w:w="9638"/>
+        <w:tblBorders>
+          <w:top w:val="single" w:color="auto" w:sz="4"/>
+          <w:left w:val="single" w:color="auto" w:sz="4"/>
+          <w:bottom w:val="single" w:color="auto" w:sz="4"/>
+          <w:right w:val="single" w:color="auto" w:sz="4"/>
+          <w:insideH w:val="single" w:color="auto" w:sz="4"/>
+          <w:insideV w:val="single" w:color="auto" w:sz="4"/>
+        </w:tblBorders>
+      </w:tblPr>
+      <w:tblGrid>
+        <w:gridCol w:w="4380"/>
+        <w:gridCol w:w="2190"/>
+        <w:gridCol w:w="3068"/>
+      </w:tblGrid>
+      <w:tr>
+        <w:trPr>
+          <w:tblHeader/>
+        </w:trPr>
+        <w:tc>
+          <w:tcPr>
+            <w:tcW w:type="dxa" w:w="4380"/>
+            <w:tcBorders>
+              <w:top w:val="single" w:color="BFBFBF" w:sz="4"/>
+              <w:left w:val="single" w:color="BFBFBF" w:sz="4"/>
+              <w:bottom w:val="single" w:color="BFBFBF" w:sz="4"/>
+              <w:right w:val="single" w:color="BFBFBF" w:sz="4"/>
+            </w:tcBorders>
+            <w:shd w:fill="F2F2F2" w:color="auto" w:val="clear"/>
+            <w:tcMar>
+              <w:top w:type="dxa" w:w="80"/>
+              <w:left w:type="dxa" w:w="120"/>
+              <w:bottom w:type="dxa" w:w="80"/>
+              <w:right w:type="dxa" w:w="120"/>
+            </w:tcMar>
+          </w:tcPr>
+          <w:p>
+            <w:pPr>
+              <w:spacing w:after="0" w:before="0"/>
+            </w:pPr>
+            <w:r>
+              <w:rPr>
+                <w:rFonts w:ascii="Arial" w:cs="Arial" w:eastAsia="Arial" w:hAnsi="Arial"/>
+                <w:b/>
+                <w:bCs/>
+                <w:sz w:val="18"/>
+                <w:szCs w:val="18"/>
+              </w:rPr>
+              <w:t xml:space="preserve">Product, code or partner</w:t>
+            </w:r>
+          </w:p>
+        </w:tc>
+        <w:tc>
+          <w:tcPr>
+            <w:tcW w:type="dxa" w:w="2190"/>
+            <w:tcBorders>
+              <w:top w:val="single" w:color="BFBFBF" w:sz="4"/>
+              <w:left w:val="single" w:color="BFBFBF" w:sz="4"/>
+              <w:bottom w:val="single" w:color="BFBFBF" w:sz="4"/>
+              <w:right w:val="single" w:color="BFBFBF" w:sz="4"/>
+            </w:tcBorders>
+            <w:shd w:fill="F2F2F2" w:color="auto" w:val="clear"/>
+            <w:tcMar>
+              <w:top w:type="dxa" w:w="80"/>
+              <w:left w:type="dxa" w:w="120"/>
+              <w:bottom w:type="dxa" w:w="80"/>
+              <w:right w:type="dxa" w:w="120"/>
+            </w:tcMar>
+          </w:tcPr>
+          <w:p>
+            <w:pPr>
+              <w:spacing w:after="0" w:before="0"/>
+            </w:pPr>
+            <w:r>
+              <w:rPr>
+                <w:rFonts w:ascii="Arial" w:cs="Arial" w:eastAsia="Arial" w:hAnsi="Arial"/>
+                <w:b/>
+                <w:bCs/>
+                <w:sz w:val="18"/>
+                <w:szCs w:val="18"/>
+              </w:rPr>
+              <w:t xml:space="preserve">Price ($)</w:t>
+            </w:r>
+          </w:p>
+        </w:tc>
+        <w:tc>
+          <w:tcPr>
+            <w:tcW w:type="dxa" w:w="3068"/>
+            <w:tcBorders>
+              <w:top w:val="single" w:color="BFBFBF" w:sz="4"/>
+              <w:left w:val="single" w:color="BFBFBF" w:sz="4"/>
+              <w:bottom w:val="single" w:color="BFBFBF" w:sz="4"/>
+              <w:right w:val="single" w:color="BFBFBF" w:sz="4"/>
+            </w:tcBorders>
+            <w:shd w:fill="F2F2F2" w:color="auto" w:val="clear"/>
+            <w:tcMar>
+              <w:top w:type="dxa" w:w="80"/>
+              <w:left w:type="dxa" w:w="120"/>
+              <w:bottom w:type="dxa" w:w="80"/>
+              <w:right w:type="dxa" w:w="120"/>
+            </w:tcMar>
+          </w:tcPr>
+          <w:p>
+            <w:pPr>
+              <w:spacing w:after="0" w:before="0"/>
+            </w:pPr>
+            <w:r>
+              <w:rPr>
+                <w:rFonts w:ascii="Arial" w:cs="Arial" w:eastAsia="Arial" w:hAnsi="Arial"/>
+                <w:b/>
+                <w:bCs/>
+                <w:sz w:val="18"/>
+                <w:szCs w:val="18"/>
+              </w:rPr>
+              <w:t xml:space="preserve">Link or code</w:t>
+            </w:r>
+          </w:p>
+        </w:tc>
+      </w:tr>
+      <w:tr>
+        <w:trPr>
+          <w:cantSplit/>
+          <w:trHeight w:val="460" w:hRule="atLeast"/>
+        </w:trPr>
+        <w:tc>
+          <w:tcPr>
+            <w:tcW w:type="dxa" w:w="4380"/>
+            <w:tcBorders>
+              <w:top w:val="single" w:color="BFBFBF" w:sz="4"/>
+              <w:left w:val="single" w:color="BFBFBF" w:sz="4"/>
+              <w:bottom w:val="single" w:color="BFBFBF" w:sz="4"/>
+              <w:right w:val="single" w:color="BFBFBF" w:sz="4"/>
+            </w:tcBorders>
+            <w:tcMar>
+              <w:top w:type="dxa" w:w="80"/>
+              <w:left w:type="dxa" w:w="120"/>
+              <w:bottom w:type="dxa" w:w="80"/>
+              <w:right w:type="dxa" w:w="120"/>
+            </w:tcMar>
+          </w:tcPr>
+          <w:p>
+            <w:pPr>
+              <w:spacing w:after="0" w:before="0"/>
+            </w:pPr>
+            <w:r>
+              <w:rPr>
+                <w:rFonts w:ascii="Arial" w:cs="Arial" w:eastAsia="Arial" w:hAnsi="Arial"/>
+                <w:sz w:val="21"/>
+                <w:szCs w:val="21"/>
+              </w:rPr>
+              <w:t xml:space="preserve"/>
+            </w:r>
+          </w:p>
+        </w:tc>
+        <w:tc>
+          <w:tcPr>
+            <w:tcW w:type="dxa" w:w="2190"/>
+            <w:tcBorders>
+              <w:top w:val="single" w:color="BFBFBF" w:sz="4"/>
+              <w:left w:val="single" w:color="BFBFBF" w:sz="4"/>
+              <w:bottom w:val="single" w:color="BFBFBF" w:sz="4"/>
+              <w:right w:val="single" w:color="BFBFBF" w:sz="4"/>
+            </w:tcBorders>
+            <w:tcMar>
+              <w:top w:type="dxa" w:w="80"/>
+              <w:left w:type="dxa" w:w="120"/>
+              <w:bottom w:type="dxa" w:w="80"/>
+              <w:right w:type="dxa" w:w="120"/>
+            </w:tcMar>
+          </w:tcPr>
+          <w:p>
+            <w:pPr>
+              <w:spacing w:after="0" w:before="0"/>
+            </w:pPr>
+            <w:r>
+              <w:rPr>
+                <w:rFonts w:ascii="Arial" w:cs="Arial" w:eastAsia="Arial" w:hAnsi="Arial"/>
+                <w:sz w:val="21"/>
+                <w:szCs w:val="21"/>
+              </w:rPr>
+              <w:t xml:space="preserve"/>
+            </w:r>
+          </w:p>
+        </w:tc>
+        <w:tc>
+          <w:tcPr>
+            <w:tcW w:type="dxa" w:w="3068"/>
+            <w:tcBorders>
+              <w:top w:val="single" w:color="BFBFBF" w:sz="4"/>
+              <w:left w:val="single" w:color="BFBFBF" w:sz="4"/>
+              <w:bottom w:val="single" w:color="BFBFBF" w:sz="4"/>
+              <w:right w:val="single" w:color="BFBFBF" w:sz="4"/>
+            </w:tcBorders>
+            <w:tcMar>
+              <w:top w:type="dxa" w:w="80"/>
+              <w:left w:type="dxa" w:w="120"/>
+              <w:bottom w:type="dxa" w:w="80"/>
+              <w:right w:type="dxa" w:w="120"/>
+            </w:tcMar>
+          </w:tcPr>
+          <w:p>
+            <w:pPr>
+              <w:spacing w:after="0" w:before="0"/>
+            </w:pPr>
+            <w:r>
+              <w:rPr>
+                <w:rFonts w:ascii="Arial" w:cs="Arial" w:eastAsia="Arial" w:hAnsi="Arial"/>
+                <w:sz w:val="21"/>
+                <w:szCs w:val="21"/>
+              </w:rPr>
+              <w:t xml:space="preserve"/>
+            </w:r>
+          </w:p>
+        </w:tc>
+      </w:tr>
+      <w:tr>
+        <w:trPr>
+          <w:cantSplit/>
+          <w:trHeight w:val="460" w:hRule="atLeast"/>
+        </w:trPr>
+        <w:tc>
+          <w:tcPr>
+            <w:tcW w:type="dxa" w:w="4380"/>
+            <w:tcBorders>
+              <w:top w:val="single" w:color="BFBFBF" w:sz="4"/>
+              <w:left w:val="single" w:color="BFBFBF" w:sz="4"/>
+              <w:bottom w:val="single" w:color="BFBFBF" w:sz="4"/>
+              <w:right w:val="single" w:color="BFBFBF" w:sz="4"/>
+            </w:tcBorders>
+            <w:tcMar>
+              <w:top w:type="dxa" w:w="80"/>
+              <w:left w:type="dxa" w:w="120"/>
+              <w:bottom w:type="dxa" w:w="80"/>
+              <w:right w:type="dxa" w:w="120"/>
+            </w:tcMar>
+          </w:tcPr>
+          <w:p>
+            <w:pPr>
+              <w:spacing w:after="0" w:before="0"/>
+            </w:pPr>
+            <w:r>
+              <w:rPr>
+                <w:rFonts w:ascii="Arial" w:cs="Arial" w:eastAsia="Arial" w:hAnsi="Arial"/>
+                <w:sz w:val="21"/>
+                <w:szCs w:val="21"/>
+              </w:rPr>
+              <w:t xml:space="preserve"/>
+            </w:r>
+          </w:p>
+        </w:tc>
+        <w:tc>
+          <w:tcPr>
+            <w:tcW w:type="dxa" w:w="2190"/>
+            <w:tcBorders>
+              <w:top w:val="single" w:color="BFBFBF" w:sz="4"/>
+              <w:left w:val="single" w:color="BFBFBF" w:sz="4"/>
+              <w:bottom w:val="single" w:color="BFBFBF" w:sz="4"/>
+              <w:right w:val="single" w:color="BFBFBF" w:sz="4"/>
+            </w:tcBorders>
+            <w:tcMar>
+              <w:top w:type="dxa" w:w="80"/>
+              <w:left w:type="dxa" w:w="120"/>
+              <w:bottom w:type="dxa" w:w="80"/>
+              <w:right w:type="dxa" w:w="120"/>
+            </w:tcMar>
+          </w:tcPr>
+          <w:p>
+            <w:pPr>
+              <w:spacing w:after="0" w:before="0"/>
+            </w:pPr>
+            <w:r>
+              <w:rPr>
+                <w:rFonts w:ascii="Arial" w:cs="Arial" w:eastAsia="Arial" w:hAnsi="Arial"/>
+                <w:sz w:val="21"/>
+                <w:szCs w:val="21"/>
+              </w:rPr>
+              <w:t xml:space="preserve"/>
+            </w:r>
+          </w:p>
+        </w:tc>
+        <w:tc>
+          <w:tcPr>
+            <w:tcW w:type="dxa" w:w="3068"/>
+            <w:tcBorders>
+              <w:top w:val="single" w:color="BFBFBF" w:sz="4"/>
+              <w:left w:val="single" w:color="BFBFBF" w:sz="4"/>
+              <w:bottom w:val="single" w:color="BFBFBF" w:sz="4"/>
+              <w:right w:val="single" w:color="BFBFBF" w:sz="4"/>
+            </w:tcBorders>
+            <w:tcMar>
+              <w:top w:type="dxa" w:w="80"/>
+              <w:left w:type="dxa" w:w="120"/>
+              <w:bottom w:type="dxa" w:w="80"/>
+              <w:right w:type="dxa" w:w="120"/>
+            </w:tcMar>
+          </w:tcPr>
+          <w:p>
+            <w:pPr>
+              <w:spacing w:after="0" w:before="0"/>
+            </w:pPr>
+            <w:r>
+              <w:rPr>
+                <w:rFonts w:ascii="Arial" w:cs="Arial" w:eastAsia="Arial" w:hAnsi="Arial"/>
+                <w:sz w:val="21"/>
+                <w:szCs w:val="21"/>
+              </w:rPr>
+              <w:t xml:space="preserve"/>
+            </w:r>
+          </w:p>
+        </w:tc>
+      </w:tr>
+      <w:tr>
+        <w:trPr>
+          <w:cantSplit/>
+          <w:trHeight w:val="460" w:hRule="atLeast"/>
+        </w:trPr>
+        <w:tc>
+          <w:tcPr>
+            <w:tcW w:type="dxa" w:w="4380"/>
+            <w:tcBorders>
+              <w:top w:val="single" w:color="BFBFBF" w:sz="4"/>
+              <w:left w:val="single" w:color="BFBFBF" w:sz="4"/>
+              <w:bottom w:val="single" w:color="BFBFBF" w:sz="4"/>
+              <w:right w:val="single" w:color="BFBFBF" w:sz="4"/>
+            </w:tcBorders>
+            <w:tcMar>
+              <w:top w:type="dxa" w:w="80"/>
+              <w:left w:type="dxa" w:w="120"/>
+              <w:bottom w:type="dxa" w:w="80"/>
+              <w:right w:type="dxa" w:w="120"/>
+            </w:tcMar>
+          </w:tcPr>
+          <w:p>
+            <w:pPr>
+              <w:spacing w:after="0" w:before="0"/>
+            </w:pPr>
+            <w:r>
+              <w:rPr>
+                <w:rFonts w:ascii="Arial" w:cs="Arial" w:eastAsia="Arial" w:hAnsi="Arial"/>
+                <w:sz w:val="21"/>
+                <w:szCs w:val="21"/>
+              </w:rPr>
+              <w:t xml:space="preserve"/>
+            </w:r>
+          </w:p>
+        </w:tc>
+        <w:tc>
+          <w:tcPr>
+            <w:tcW w:type="dxa" w:w="2190"/>
+            <w:tcBorders>
+              <w:top w:val="single" w:color="BFBFBF" w:sz="4"/>
+              <w:left w:val="single" w:color="BFBFBF" w:sz="4"/>
+              <w:bottom w:val="single" w:color="BFBFBF" w:sz="4"/>
+              <w:right w:val="single" w:color="BFBFBF" w:sz="4"/>
+            </w:tcBorders>
+            <w:tcMar>
+              <w:top w:type="dxa" w:w="80"/>
+              <w:left w:type="dxa" w:w="120"/>
+              <w:bottom w:type="dxa" w:w="80"/>
+              <w:right w:type="dxa" w:w="120"/>
+            </w:tcMar>
+          </w:tcPr>
+          <w:p>
+            <w:pPr>
+              <w:spacing w:after="0" w:before="0"/>
+            </w:pPr>
+            <w:r>
+              <w:rPr>
+                <w:rFonts w:ascii="Arial" w:cs="Arial" w:eastAsia="Arial" w:hAnsi="Arial"/>
+                <w:sz w:val="21"/>
+                <w:szCs w:val="21"/>
+              </w:rPr>
+              <w:t xml:space="preserve"/>
+            </w:r>
+          </w:p>
+        </w:tc>
+        <w:tc>
+          <w:tcPr>
+            <w:tcW w:type="dxa" w:w="3068"/>
+            <w:tcBorders>
+              <w:top w:val="single" w:color="BFBFBF" w:sz="4"/>
+              <w:left w:val="single" w:color="BFBFBF" w:sz="4"/>
+              <w:bottom w:val="single" w:color="BFBFBF" w:sz="4"/>
+              <w:right w:val="single" w:color="BFBFBF" w:sz="4"/>
+            </w:tcBorders>
+            <w:tcMar>
+              <w:top w:type="dxa" w:w="80"/>
+              <w:left w:type="dxa" w:w="120"/>
+              <w:bottom w:type="dxa" w:w="80"/>
+              <w:right w:type="dxa" w:w="120"/>
+            </w:tcMar>
+          </w:tcPr>
+          <w:p>
+            <w:pPr>
+              <w:spacing w:after="0" w:before="0"/>
+            </w:pPr>
+            <w:r>
+              <w:rPr>
+                <w:rFonts w:ascii="Arial" w:cs="Arial" w:eastAsia="Arial" w:hAnsi="Arial"/>
+                <w:sz w:val="21"/>
+                <w:szCs w:val="21"/>
+              </w:rPr>
+              <w:t xml:space="preserve"/>
+            </w:r>
+          </w:p>
+        </w:tc>
+      </w:tr>
+      <w:tr>
+        <w:trPr>
+          <w:cantSplit/>
+          <w:trHeight w:val="460" w:hRule="atLeast"/>
+        </w:trPr>
+        <w:tc>
+          <w:tcPr>
+            <w:tcW w:type="dxa" w:w="4380"/>
+            <w:tcBorders>
+              <w:top w:val="single" w:color="BFBFBF" w:sz="4"/>
+              <w:left w:val="single" w:color="BFBFBF" w:sz="4"/>
+              <w:bottom w:val="single" w:color="BFBFBF" w:sz="4"/>
+              <w:right w:val="single" w:color="BFBFBF" w:sz="4"/>
+            </w:tcBorders>
+            <w:tcMar>
+              <w:top w:type="dxa" w:w="80"/>
+              <w:left w:type="dxa" w:w="120"/>
+              <w:bottom w:type="dxa" w:w="80"/>
+              <w:right w:type="dxa" w:w="120"/>
+            </w:tcMar>
+          </w:tcPr>
+          <w:p>
+            <w:pPr>
+              <w:spacing w:after="0" w:before="0"/>
+            </w:pPr>
+            <w:r>
+              <w:rPr>
+                <w:rFonts w:ascii="Arial" w:cs="Arial" w:eastAsia="Arial" w:hAnsi="Arial"/>
+                <w:sz w:val="21"/>
+                <w:szCs w:val="21"/>
+              </w:rPr>
+              <w:t xml:space="preserve"/>
+            </w:r>
+          </w:p>
+        </w:tc>
+        <w:tc>
+          <w:tcPr>
+            <w:tcW w:type="dxa" w:w="2190"/>
+            <w:tcBorders>
+              <w:top w:val="single" w:color="BFBFBF" w:sz="4"/>
+              <w:left w:val="single" w:color="BFBFBF" w:sz="4"/>
+              <w:bottom w:val="single" w:color="BFBFBF" w:sz="4"/>
+              <w:right w:val="single" w:color="BFBFBF" w:sz="4"/>
+            </w:tcBorders>
+            <w:tcMar>
+              <w:top w:type="dxa" w:w="80"/>
+              <w:left w:type="dxa" w:w="120"/>
+              <w:bottom w:type="dxa" w:w="80"/>
+              <w:right w:type="dxa" w:w="120"/>
+            </w:tcMar>
+          </w:tcPr>
+          <w:p>
+            <w:pPr>
+              <w:spacing w:after="0" w:before="0"/>
+            </w:pPr>
+            <w:r>
+              <w:rPr>
+                <w:rFonts w:ascii="Arial" w:cs="Arial" w:eastAsia="Arial" w:hAnsi="Arial"/>
+                <w:sz w:val="21"/>
+                <w:szCs w:val="21"/>
+              </w:rPr>
+              <w:t xml:space="preserve"/>
+            </w:r>
+          </w:p>
+        </w:tc>
+        <w:tc>
+          <w:tcPr>
+            <w:tcW w:type="dxa" w:w="3068"/>
+            <w:tcBorders>
+              <w:top w:val="single" w:color="BFBFBF" w:sz="4"/>
+              <w:left w:val="single" w:color="BFBFBF" w:sz="4"/>
+              <w:bottom w:val="single" w:color="BFBFBF" w:sz="4"/>
+              <w:right w:val="single" w:color="BFBFBF" w:sz="4"/>
+            </w:tcBorders>
+            <w:tcMar>
+              <w:top w:type="dxa" w:w="80"/>
+              <w:left w:type="dxa" w:w="120"/>
+              <w:bottom w:type="dxa" w:w="80"/>
+              <w:right w:type="dxa" w:w="120"/>
+            </w:tcMar>
+          </w:tcPr>
+          <w:p>
+            <w:pPr>
+              <w:spacing w:after="0" w:before="0"/>
+            </w:pPr>
+            <w:r>
+              <w:rPr>
+                <w:rFonts w:ascii="Arial" w:cs="Arial" w:eastAsia="Arial" w:hAnsi="Arial"/>
+                <w:sz w:val="21"/>
+                <w:szCs w:val="21"/>
+              </w:rPr>
+              <w:t xml:space="preserve"/>
+            </w:r>
+          </w:p>
+        </w:tc>
+      </w:tr>
+      <w:tr>
+        <w:trPr>
+          <w:cantSplit/>
+          <w:trHeight w:val="460" w:hRule="atLeast"/>
+        </w:trPr>
+        <w:tc>
+          <w:tcPr>
+            <w:tcW w:type="dxa" w:w="4380"/>
+            <w:tcBorders>
+              <w:top w:val="single" w:color="BFBFBF" w:sz="4"/>
+              <w:left w:val="single" w:color="BFBFBF" w:sz="4"/>
+              <w:bottom w:val="single" w:color="BFBFBF" w:sz="4"/>
+              <w:right w:val="single" w:color="BFBFBF" w:sz="4"/>
+            </w:tcBorders>
+            <w:tcMar>
+              <w:top w:type="dxa" w:w="80"/>
+              <w:left w:type="dxa" w:w="120"/>
+              <w:bottom w:type="dxa" w:w="80"/>
+              <w:right w:type="dxa" w:w="120"/>
+            </w:tcMar>
+          </w:tcPr>
+          <w:p>
+            <w:pPr>
+              <w:spacing w:after="0" w:before="0"/>
+            </w:pPr>
+            <w:r>
+              <w:rPr>
+                <w:rFonts w:ascii="Arial" w:cs="Arial" w:eastAsia="Arial" w:hAnsi="Arial"/>
+                <w:sz w:val="21"/>
+                <w:szCs w:val="21"/>
+              </w:rPr>
+              <w:t xml:space="preserve"/>
+            </w:r>
+          </w:p>
+        </w:tc>
+        <w:tc>
+          <w:tcPr>
+            <w:tcW w:type="dxa" w:w="2190"/>
+            <w:tcBorders>
+              <w:top w:val="single" w:color="BFBFBF" w:sz="4"/>
+              <w:left w:val="single" w:color="BFBFBF" w:sz="4"/>
+              <w:bottom w:val="single" w:color="BFBFBF" w:sz="4"/>
+              <w:right w:val="single" w:color="BFBFBF" w:sz="4"/>
+            </w:tcBorders>
+            <w:tcMar>
+              <w:top w:type="dxa" w:w="80"/>
+              <w:left w:type="dxa" w:w="120"/>
+              <w:bottom w:type="dxa" w:w="80"/>
+              <w:right w:type="dxa" w:w="120"/>
+            </w:tcMar>
+          </w:tcPr>
+          <w:p>
+            <w:pPr>
+              <w:spacing w:after="0" w:before="0"/>
+            </w:pPr>
+            <w:r>
+              <w:rPr>
+                <w:rFonts w:ascii="Arial" w:cs="Arial" w:eastAsia="Arial" w:hAnsi="Arial"/>
+                <w:sz w:val="21"/>
+                <w:szCs w:val="21"/>
+              </w:rPr>
+              <w:t xml:space="preserve"/>
+            </w:r>
+          </w:p>
+        </w:tc>
+        <w:tc>
+          <w:tcPr>
+            <w:tcW w:type="dxa" w:w="3068"/>
+            <w:tcBorders>
+              <w:top w:val="single" w:color="BFBFBF" w:sz="4"/>
+              <w:left w:val="single" w:color="BFBFBF" w:sz="4"/>
+              <w:bottom w:val="single" w:color="BFBFBF" w:sz="4"/>
+              <w:right w:val="single" w:color="BFBFBF" w:sz="4"/>
+            </w:tcBorders>
+            <w:tcMar>
+              <w:top w:type="dxa" w:w="80"/>
+              <w:left w:type="dxa" w:w="120"/>
+              <w:bottom w:type="dxa" w:w="80"/>
+              <w:right w:type="dxa" w:w="120"/>
+            </w:tcMar>
+          </w:tcPr>
+          <w:p>
+            <w:pPr>
+              <w:spacing w:after="0" w:before="0"/>
+            </w:pPr>
+            <w:r>
+              <w:rPr>
+                <w:rFonts w:ascii="Arial" w:cs="Arial" w:eastAsia="Arial" w:hAnsi="Arial"/>
+                <w:sz w:val="21"/>
+                <w:szCs w:val="21"/>
+              </w:rPr>
+              <w:t xml:space="preserve"/>
+            </w:r>
+          </w:p>
+        </w:tc>
+      </w:tr>
+    </w:tbl>
+    <w:p>
+      <w:pPr>
+        <w:keepNext/>
         <w:pBdr>
           <w:bottom w:val="single" w:color="111111" w:sz="12" w:space="6"/>
         </w:pBdr>
@@ -1788,7 +2431,7 @@
           <w:sz w:val="22"/>
           <w:szCs w:val="22"/>
         </w:rPr>
-        <w:t xml:space="preserve">5.  </w:t>
+        <w:t xml:space="preserve">6.  </w:t>
       </w:r>
       <w:r>
         <w:rPr>
@@ -2070,7 +2713,7 @@
           <w:sz w:val="22"/>
           <w:szCs w:val="22"/>
         </w:rPr>
-        <w:t xml:space="preserve">6.  </w:t>
+        <w:t xml:space="preserve">7.  </w:t>
       </w:r>
       <w:r>
         <w:rPr>
@@ -2208,7 +2851,7 @@
           <w:sz w:val="22"/>
           <w:szCs w:val="22"/>
         </w:rPr>
-        <w:t xml:space="preserve">7.  </w:t>
+        <w:t xml:space="preserve">8.  </w:t>
       </w:r>
       <w:r>
         <w:rPr>
@@ -2422,7 +3065,7 @@
           <w:sz w:val="22"/>
           <w:szCs w:val="22"/>
         </w:rPr>
-        <w:t xml:space="preserve">8.  </w:t>
+        <w:t xml:space="preserve">9.  </w:t>
       </w:r>
       <w:r>
         <w:rPr>
@@ -2622,6 +3265,74 @@
           </w:p>
         </w:tc>
       </w:tr>
+      <w:tr>
+        <w:trPr>
+          <w:cantSplit/>
+          <w:trHeight w:val="700" w:hRule="atLeast"/>
+        </w:trPr>
+        <w:tc>
+          <w:tcPr>
+            <w:tcW w:type="dxa" w:w="3470"/>
+            <w:tcBorders>
+              <w:top w:val="single" w:color="BFBFBF" w:sz="4"/>
+              <w:left w:val="single" w:color="BFBFBF" w:sz="4"/>
+              <w:bottom w:val="single" w:color="BFBFBF" w:sz="4"/>
+              <w:right w:val="single" w:color="BFBFBF" w:sz="4"/>
+            </w:tcBorders>
+            <w:shd w:fill="F2F2F2" w:color="auto" w:val="clear"/>
+            <w:tcMar>
+              <w:top w:type="dxa" w:w="80"/>
+              <w:left w:type="dxa" w:w="120"/>
+              <w:bottom w:type="dxa" w:w="80"/>
+              <w:right w:type="dxa" w:w="120"/>
+            </w:tcMar>
+          </w:tcPr>
+          <w:p>
+            <w:pPr>
+              <w:spacing w:after="0" w:before="0"/>
+            </w:pPr>
+            <w:r>
+              <w:rPr>
+                <w:rFonts w:ascii="Arial" w:cs="Arial" w:eastAsia="Arial" w:hAnsi="Arial"/>
+                <w:color w:val="6F6F6F"/>
+                <w:sz w:val="18"/>
+                <w:szCs w:val="18"/>
+              </w:rPr>
+              <w:t xml:space="preserve">What's everyone in your niche posting that you're sick of seeing?</w:t>
+            </w:r>
+          </w:p>
+        </w:tc>
+        <w:tc>
+          <w:tcPr>
+            <w:tcW w:type="dxa" w:w="6168"/>
+            <w:tcBorders>
+              <w:top w:val="single" w:color="BFBFBF" w:sz="4"/>
+              <w:left w:val="single" w:color="BFBFBF" w:sz="4"/>
+              <w:bottom w:val="single" w:color="BFBFBF" w:sz="4"/>
+              <w:right w:val="single" w:color="BFBFBF" w:sz="4"/>
+            </w:tcBorders>
+            <w:tcMar>
+              <w:top w:type="dxa" w:w="80"/>
+              <w:left w:type="dxa" w:w="120"/>
+              <w:bottom w:type="dxa" w:w="80"/>
+              <w:right w:type="dxa" w:w="120"/>
+            </w:tcMar>
+          </w:tcPr>
+          <w:p>
+            <w:pPr>
+              <w:spacing w:after="0" w:before="0"/>
+            </w:pPr>
+            <w:r>
+              <w:rPr>
+                <w:rFonts w:ascii="Arial" w:cs="Arial" w:eastAsia="Arial" w:hAnsi="Arial"/>
+                <w:sz w:val="21"/>
+                <w:szCs w:val="21"/>
+              </w:rPr>
+              <w:t xml:space="preserve"/>
+            </w:r>
+          </w:p>
+        </w:tc>
+      </w:tr>
     </w:tbl>
     <w:p>
       <w:pPr>
@@ -2636,7 +3347,7 @@
           <w:sz w:val="22"/>
           <w:szCs w:val="22"/>
         </w:rPr>
-        <w:t xml:space="preserve">9.  </w:t>
+        <w:t xml:space="preserve">10.  </w:t>
       </w:r>
       <w:r>
         <w:rPr>
@@ -2821,6 +3532,294 @@
           </w:p>
         </w:tc>
       </w:tr>
+      <w:tr>
+        <w:trPr>
+          <w:cantSplit/>
+          <w:trHeight w:val="700" w:hRule="atLeast"/>
+        </w:trPr>
+        <w:tc>
+          <w:tcPr>
+            <w:tcW w:type="dxa" w:w="3470"/>
+            <w:tcBorders>
+              <w:top w:val="single" w:color="BFBFBF" w:sz="4"/>
+              <w:left w:val="single" w:color="BFBFBF" w:sz="4"/>
+              <w:bottom w:val="single" w:color="BFBFBF" w:sz="4"/>
+              <w:right w:val="single" w:color="BFBFBF" w:sz="4"/>
+            </w:tcBorders>
+            <w:shd w:fill="F2F2F2" w:color="auto" w:val="clear"/>
+            <w:tcMar>
+              <w:top w:type="dxa" w:w="80"/>
+              <w:left w:type="dxa" w:w="120"/>
+              <w:bottom w:type="dxa" w:w="80"/>
+              <w:right w:type="dxa" w:w="120"/>
+            </w:tcMar>
+          </w:tcPr>
+          <w:p>
+            <w:pPr>
+              <w:spacing w:after="0" w:before="0"/>
+            </w:pPr>
+            <w:r>
+              <w:rPr>
+                <w:rFonts w:ascii="Arial" w:cs="Arial" w:eastAsia="Arial" w:hAnsi="Arial"/>
+                <w:color w:val="6F6F6F"/>
+                <w:sz w:val="18"/>
+                <w:szCs w:val="18"/>
+              </w:rPr>
+              <w:t xml:space="preserve">What do people assume about you or your niche before they follow, and what's actually true?</w:t>
+            </w:r>
+          </w:p>
+        </w:tc>
+        <w:tc>
+          <w:tcPr>
+            <w:tcW w:type="dxa" w:w="6168"/>
+            <w:tcBorders>
+              <w:top w:val="single" w:color="BFBFBF" w:sz="4"/>
+              <w:left w:val="single" w:color="BFBFBF" w:sz="4"/>
+              <w:bottom w:val="single" w:color="BFBFBF" w:sz="4"/>
+              <w:right w:val="single" w:color="BFBFBF" w:sz="4"/>
+            </w:tcBorders>
+            <w:tcMar>
+              <w:top w:type="dxa" w:w="80"/>
+              <w:left w:type="dxa" w:w="120"/>
+              <w:bottom w:type="dxa" w:w="80"/>
+              <w:right w:type="dxa" w:w="120"/>
+            </w:tcMar>
+          </w:tcPr>
+          <w:p>
+            <w:pPr>
+              <w:spacing w:after="0" w:before="0"/>
+            </w:pPr>
+            <w:r>
+              <w:rPr>
+                <w:rFonts w:ascii="Arial" w:cs="Arial" w:eastAsia="Arial" w:hAnsi="Arial"/>
+                <w:sz w:val="21"/>
+                <w:szCs w:val="21"/>
+              </w:rPr>
+              <w:t xml:space="preserve"/>
+            </w:r>
+          </w:p>
+        </w:tc>
+      </w:tr>
+    </w:tbl>
+    <w:p>
+      <w:pPr>
+        <w:keepNext/>
+        <w:spacing w:after="60" w:before="280"/>
+      </w:pPr>
+      <w:r>
+        <w:rPr>
+          <w:rFonts w:ascii="Arial" w:cs="Arial" w:eastAsia="Arial" w:hAnsi="Arial"/>
+          <w:b/>
+          <w:bCs/>
+          <w:sz w:val="22"/>
+          <w:szCs w:val="22"/>
+        </w:rPr>
+        <w:t xml:space="preserve">11.  </w:t>
+      </w:r>
+      <w:r>
+        <w:rPr>
+          <w:rFonts w:ascii="Arial" w:cs="Arial" w:eastAsia="Arial" w:hAnsi="Arial"/>
+          <w:b/>
+          <w:bCs/>
+          <w:sz w:val="22"/>
+          <w:szCs w:val="22"/>
+        </w:rPr>
+        <w:t xml:space="preserve">How do you talk on camera?</w:t>
+      </w:r>
+    </w:p>
+    <w:p>
+      <w:pPr>
+        <w:keepNext/>
+        <w:spacing w:after="80" w:before="0"/>
+      </w:pPr>
+      <w:r>
+        <w:rPr>
+          <w:rFonts w:ascii="Arial" w:cs="Arial" w:eastAsia="Arial" w:hAnsi="Arial"/>
+          <w:color w:val="6F6F6F"/>
+          <w:sz w:val="19"/>
+          <w:szCs w:val="19"/>
+        </w:rPr>
+        <w:t xml:space="preserve">Sayings, catchphrases, how you open and sign off, words you'd never use. This is how we write lines that sound like you, not like an ad.</w:t>
+      </w:r>
+    </w:p>
+    <w:p>
+      <w:pPr>
+        <w:keepNext/>
+        <w:spacing w:after="80" w:before="0"/>
+      </w:pPr>
+      <w:r>
+        <w:rPr>
+          <w:rFonts w:ascii="Arial" w:cs="Arial" w:eastAsia="Arial" w:hAnsi="Arial"/>
+          <w:i/>
+          <w:iCs/>
+          <w:color w:val="9A9A9A"/>
+          <w:sz w:val="18"/>
+          <w:szCs w:val="18"/>
+        </w:rPr>
+        <w:t xml:space="preserve">e.g. Always open with "right, broke student dinner time". Never say "hack".</w:t>
+      </w:r>
+    </w:p>
+    <w:tbl>
+      <w:tblPr>
+        <w:tblW w:type="dxa" w:w="9638"/>
+        <w:tblBorders>
+          <w:top w:val="single" w:color="auto" w:sz="4"/>
+          <w:left w:val="single" w:color="auto" w:sz="4"/>
+          <w:bottom w:val="single" w:color="auto" w:sz="4"/>
+          <w:right w:val="single" w:color="auto" w:sz="4"/>
+          <w:insideH w:val="single" w:color="auto" w:sz="4"/>
+          <w:insideV w:val="single" w:color="auto" w:sz="4"/>
+        </w:tblBorders>
+      </w:tblPr>
+      <w:tblGrid>
+        <w:gridCol w:w="9638"/>
+      </w:tblGrid>
+      <w:tr>
+        <w:trPr>
+          <w:cantSplit/>
+          <w:trHeight w:val="1300" w:hRule="atLeast"/>
+        </w:trPr>
+        <w:tc>
+          <w:tcPr>
+            <w:tcW w:type="dxa" w:w="9638"/>
+            <w:tcBorders>
+              <w:top w:val="single" w:color="BFBFBF" w:sz="4"/>
+              <w:left w:val="single" w:color="BFBFBF" w:sz="4"/>
+              <w:bottom w:val="single" w:color="BFBFBF" w:sz="4"/>
+              <w:right w:val="single" w:color="BFBFBF" w:sz="4"/>
+            </w:tcBorders>
+            <w:tcMar>
+              <w:top w:type="dxa" w:w="80"/>
+              <w:left w:type="dxa" w:w="120"/>
+              <w:bottom w:type="dxa" w:w="80"/>
+              <w:right w:type="dxa" w:w="120"/>
+            </w:tcMar>
+          </w:tcPr>
+          <w:p>
+            <w:pPr>
+              <w:spacing w:after="0" w:before="0"/>
+            </w:pPr>
+            <w:r>
+              <w:rPr>
+                <w:rFonts w:ascii="Arial" w:cs="Arial" w:eastAsia="Arial" w:hAnsi="Arial"/>
+                <w:sz w:val="21"/>
+                <w:szCs w:val="21"/>
+              </w:rPr>
+              <w:t xml:space="preserve"/>
+            </w:r>
+          </w:p>
+        </w:tc>
+      </w:tr>
+    </w:tbl>
+    <w:p>
+      <w:pPr>
+        <w:keepNext/>
+        <w:spacing w:after="60" w:before="280"/>
+      </w:pPr>
+      <w:r>
+        <w:rPr>
+          <w:rFonts w:ascii="Arial" w:cs="Arial" w:eastAsia="Arial" w:hAnsi="Arial"/>
+          <w:b/>
+          <w:bCs/>
+          <w:sz w:val="22"/>
+          <w:szCs w:val="22"/>
+        </w:rPr>
+        <w:t xml:space="preserve">12.  </w:t>
+      </w:r>
+      <w:r>
+        <w:rPr>
+          <w:rFonts w:ascii="Arial" w:cs="Arial" w:eastAsia="Arial" w:hAnsi="Arial"/>
+          <w:b/>
+          <w:bCs/>
+          <w:sz w:val="22"/>
+          <w:szCs w:val="22"/>
+        </w:rPr>
+        <w:t xml:space="preserve">What's your thing?</w:t>
+      </w:r>
+    </w:p>
+    <w:p>
+      <w:pPr>
+        <w:keepNext/>
+        <w:spacing w:after="80" w:before="0"/>
+      </w:pPr>
+      <w:r>
+        <w:rPr>
+          <w:rFonts w:ascii="Arial" w:cs="Arial" w:eastAsia="Arial" w:hAnsi="Arial"/>
+          <w:color w:val="6F6F6F"/>
+          <w:sz w:val="19"/>
+          <w:szCs w:val="19"/>
+        </w:rPr>
+        <w:t xml:space="preserve">The signature detail people know you for: a setup, a prop, a running joke, a pet, a phrase.</w:t>
+      </w:r>
+    </w:p>
+    <w:p>
+      <w:pPr>
+        <w:keepNext/>
+        <w:spacing w:after="80" w:before="0"/>
+      </w:pPr>
+      <w:r>
+        <w:rPr>
+          <w:rFonts w:ascii="Arial" w:cs="Arial" w:eastAsia="Arial" w:hAnsi="Arial"/>
+          <w:i/>
+          <w:iCs/>
+          <w:color w:val="9A9A9A"/>
+          <w:sz w:val="18"/>
+          <w:szCs w:val="18"/>
+        </w:rPr>
+        <w:t xml:space="preserve">e.g. Everything's cooked on my tiny two-burner share-house stove, and it always costs under $10.</w:t>
+      </w:r>
+    </w:p>
+    <w:tbl>
+      <w:tblPr>
+        <w:tblW w:type="dxa" w:w="9638"/>
+        <w:tblBorders>
+          <w:top w:val="single" w:color="auto" w:sz="4"/>
+          <w:left w:val="single" w:color="auto" w:sz="4"/>
+          <w:bottom w:val="single" w:color="auto" w:sz="4"/>
+          <w:right w:val="single" w:color="auto" w:sz="4"/>
+          <w:insideH w:val="single" w:color="auto" w:sz="4"/>
+          <w:insideV w:val="single" w:color="auto" w:sz="4"/>
+        </w:tblBorders>
+      </w:tblPr>
+      <w:tblGrid>
+        <w:gridCol w:w="9638"/>
+      </w:tblGrid>
+      <w:tr>
+        <w:trPr>
+          <w:cantSplit/>
+          <w:trHeight w:val="1300" w:hRule="atLeast"/>
+        </w:trPr>
+        <w:tc>
+          <w:tcPr>
+            <w:tcW w:type="dxa" w:w="9638"/>
+            <w:tcBorders>
+              <w:top w:val="single" w:color="BFBFBF" w:sz="4"/>
+              <w:left w:val="single" w:color="BFBFBF" w:sz="4"/>
+              <w:bottom w:val="single" w:color="BFBFBF" w:sz="4"/>
+              <w:right w:val="single" w:color="BFBFBF" w:sz="4"/>
+            </w:tcBorders>
+            <w:tcMar>
+              <w:top w:type="dxa" w:w="80"/>
+              <w:left w:type="dxa" w:w="120"/>
+              <w:bottom w:type="dxa" w:w="80"/>
+              <w:right w:type="dxa" w:w="120"/>
+            </w:tcMar>
+          </w:tcPr>
+          <w:p>
+            <w:pPr>
+              <w:spacing w:after="0" w:before="0"/>
+            </w:pPr>
+            <w:r>
+              <w:rPr>
+                <w:rFonts w:ascii="Arial" w:cs="Arial" w:eastAsia="Arial" w:hAnsi="Arial"/>
+                <w:sz w:val="21"/>
+                <w:szCs w:val="21"/>
+              </w:rPr>
+              <w:t xml:space="preserve"/>
+            </w:r>
+          </w:p>
+        </w:tc>
+      </w:tr>
     </w:tbl>
     <w:p>
       <w:pPr>
@@ -2863,7 +3862,7 @@
           <w:sz w:val="22"/>
           <w:szCs w:val="22"/>
         </w:rPr>
-        <w:t xml:space="preserve">10.  </w:t>
+        <w:t xml:space="preserve">13.  </w:t>
       </w:r>
       <w:r>
         <w:rPr>
@@ -3574,7 +4573,7 @@
           <w:sz w:val="22"/>
           <w:szCs w:val="22"/>
         </w:rPr>
-        <w:t xml:space="preserve">11.  </w:t>
+        <w:t xml:space="preserve">14.  </w:t>
       </w:r>
       <w:r>
         <w:rPr>
@@ -3816,7 +4815,7 @@
           <w:sz w:val="22"/>
           <w:szCs w:val="22"/>
         </w:rPr>
-        <w:t xml:space="preserve">12.  </w:t>
+        <w:t xml:space="preserve">15.  </w:t>
       </w:r>
       <w:r>
         <w:rPr>
@@ -4200,7 +5199,7 @@
           <w:sz w:val="22"/>
           <w:szCs w:val="22"/>
         </w:rPr>
-        <w:t xml:space="preserve">13.  </w:t>
+        <w:t xml:space="preserve">16.  </w:t>
       </w:r>
       <w:r>
         <w:rPr>
@@ -4414,7 +5413,7 @@
           <w:sz w:val="22"/>
           <w:szCs w:val="22"/>
         </w:rPr>
-        <w:t xml:space="preserve">14.  </w:t>
+        <w:t xml:space="preserve">17.  </w:t>
       </w:r>
       <w:r>
         <w:rPr>
@@ -4514,6 +5513,116 @@
     <w:p>
       <w:pPr>
         <w:keepNext/>
+        <w:spacing w:after="60" w:before="280"/>
+      </w:pPr>
+      <w:r>
+        <w:rPr>
+          <w:rFonts w:ascii="Arial" w:cs="Arial" w:eastAsia="Arial" w:hAnsi="Arial"/>
+          <w:b/>
+          <w:bCs/>
+          <w:sz w:val="22"/>
+          <w:szCs w:val="22"/>
+        </w:rPr>
+        <w:t xml:space="preserve">18.  </w:t>
+      </w:r>
+      <w:r>
+        <w:rPr>
+          <w:rFonts w:ascii="Arial" w:cs="Arial" w:eastAsia="Arial" w:hAnsi="Arial"/>
+          <w:b/>
+          <w:bCs/>
+          <w:sz w:val="22"/>
+          <w:szCs w:val="22"/>
+        </w:rPr>
+        <w:t xml:space="preserve">What do you look like on a normal filming day?</w:t>
+      </w:r>
+    </w:p>
+    <w:p>
+      <w:pPr>
+        <w:keepNext/>
+        <w:spacing w:after="80" w:before="0"/>
+      </w:pPr>
+      <w:r>
+        <w:rPr>
+          <w:rFonts w:ascii="Arial" w:cs="Arial" w:eastAsia="Arial" w:hAnsi="Arial"/>
+          <w:color w:val="6F6F6F"/>
+          <w:sz w:val="19"/>
+          <w:szCs w:val="19"/>
+        </w:rPr>
+        <w:t xml:space="preserve">Age range, hair, build and what you usually wear. Same for anyone who's often in your videos. We use this to sketch your storyboards.</w:t>
+      </w:r>
+    </w:p>
+    <w:p>
+      <w:pPr>
+        <w:keepNext/>
+        <w:spacing w:after="80" w:before="0"/>
+      </w:pPr>
+      <w:r>
+        <w:rPr>
+          <w:rFonts w:ascii="Arial" w:cs="Arial" w:eastAsia="Arial" w:hAnsi="Arial"/>
+          <w:i/>
+          <w:iCs/>
+          <w:color w:val="9A9A9A"/>
+          <w:sz w:val="18"/>
+          <w:szCs w:val="18"/>
+        </w:rPr>
+        <w:t xml:space="preserve">e.g. Me: early 20s, long curly dark hair, usually a baggy op-shop jumper and gold hoops.</w:t>
+      </w:r>
+    </w:p>
+    <w:tbl>
+      <w:tblPr>
+        <w:tblW w:type="dxa" w:w="9638"/>
+        <w:tblBorders>
+          <w:top w:val="single" w:color="auto" w:sz="4"/>
+          <w:left w:val="single" w:color="auto" w:sz="4"/>
+          <w:bottom w:val="single" w:color="auto" w:sz="4"/>
+          <w:right w:val="single" w:color="auto" w:sz="4"/>
+          <w:insideH w:val="single" w:color="auto" w:sz="4"/>
+          <w:insideV w:val="single" w:color="auto" w:sz="4"/>
+        </w:tblBorders>
+      </w:tblPr>
+      <w:tblGrid>
+        <w:gridCol w:w="9638"/>
+      </w:tblGrid>
+      <w:tr>
+        <w:trPr>
+          <w:cantSplit/>
+          <w:trHeight w:val="1300" w:hRule="atLeast"/>
+        </w:trPr>
+        <w:tc>
+          <w:tcPr>
+            <w:tcW w:type="dxa" w:w="9638"/>
+            <w:tcBorders>
+              <w:top w:val="single" w:color="BFBFBF" w:sz="4"/>
+              <w:left w:val="single" w:color="BFBFBF" w:sz="4"/>
+              <w:bottom w:val="single" w:color="BFBFBF" w:sz="4"/>
+              <w:right w:val="single" w:color="BFBFBF" w:sz="4"/>
+            </w:tcBorders>
+            <w:tcMar>
+              <w:top w:type="dxa" w:w="80"/>
+              <w:left w:type="dxa" w:w="120"/>
+              <w:bottom w:type="dxa" w:w="80"/>
+              <w:right w:type="dxa" w:w="120"/>
+            </w:tcMar>
+          </w:tcPr>
+          <w:p>
+            <w:pPr>
+              <w:spacing w:after="0" w:before="0"/>
+            </w:pPr>
+            <w:r>
+              <w:rPr>
+                <w:rFonts w:ascii="Arial" w:cs="Arial" w:eastAsia="Arial" w:hAnsi="Arial"/>
+                <w:sz w:val="21"/>
+                <w:szCs w:val="21"/>
+              </w:rPr>
+              <w:t xml:space="preserve"/>
+            </w:r>
+          </w:p>
+        </w:tc>
+      </w:tr>
+    </w:tbl>
+    <w:p>
+      <w:pPr>
+        <w:keepNext/>
         <w:pBdr>
           <w:bottom w:val="single" w:color="111111" w:sz="12" w:space="6"/>
         </w:pBdr>
@@ -4552,7 +5661,7 @@
           <w:sz w:val="22"/>
           <w:szCs w:val="22"/>
         </w:rPr>
-        <w:t xml:space="preserve">15.  </w:t>
+        <w:t xml:space="preserve">19.  </w:t>
       </w:r>
       <w:r>
         <w:rPr>
@@ -4850,7 +5959,7 @@
           <w:sz w:val="22"/>
           <w:szCs w:val="22"/>
         </w:rPr>
-        <w:t xml:space="preserve">16.  </w:t>
+        <w:t xml:space="preserve">20.  </w:t>
       </w:r>
       <w:r>
         <w:rPr>
@@ -5081,7 +6190,7 @@
           <w:sz w:val="22"/>
           <w:szCs w:val="22"/>
         </w:rPr>
-        <w:t xml:space="preserve">17.  </w:t>
+        <w:t xml:space="preserve">21.  </w:t>
       </w:r>
       <w:r>
         <w:rPr>
@@ -5221,7 +6330,7 @@
           <w:sz w:val="22"/>
           <w:szCs w:val="22"/>
         </w:rPr>
-        <w:t xml:space="preserve">18.  </w:t>
+        <w:t xml:space="preserve">22.  </w:t>
       </w:r>
       <w:r>
         <w:rPr>

</xml_diff>

<commit_message>
Make goals and outcomes a required core of every brief
- New Goals section on every brief: the main goal is required, plus
  "how will we know it's working?" (the win, how it's measured, the
  starting point)
- Small Business: busy and quiet seasons, past posts that worked or flopped
- Marketing: "your numbers" (enquiries, spare capacity, most profitable
  service, Google rating, followers, ad spend)
- Creators: audience insights (age, split, locations, watch time)
- Personalised: AI hours and what's been tried; website traffic, logins
  and Google profile
- Shared folder link on every brief for insights, analytics, brand files
  and photos
- Time estimates updated

Co-Authored-By: Claude Opus 5.5 <noreply@anthropic.com>
Claude-Session: https://claude.ai/code/session_01Ekm7mBGBy9a1vDE3KYrxvW
</commit_message>
<xml_diff>
--- a/dist/word/ASAP Creator Brief.docx
+++ b/dist/word/ASAP Creator Brief.docx
@@ -1514,6 +1514,24 @@
       <w:r>
         <w:rPr>
           <w:rFonts w:ascii="Arial" w:cs="Arial" w:eastAsia="Arial" w:hAnsi="Arial"/>
+          <w:b/>
+          <w:bCs/>
+          <w:caps/>
+          <w:spacing w:val="20"/>
+          <w:sz w:val="16"/>
+          <w:szCs w:val="16"/>
+        </w:rPr>
+        <w:t xml:space="preserve">We need this one to plan your content</w:t>
+      </w:r>
+    </w:p>
+    <w:p>
+      <w:pPr>
+        <w:keepNext/>
+        <w:spacing w:after="80" w:before="0"/>
+      </w:pPr>
+      <w:r>
+        <w:rPr>
+          <w:rFonts w:ascii="Arial" w:cs="Arial" w:eastAsia="Arial" w:hAnsi="Arial"/>
           <w:i/>
           <w:iCs/>
           <w:color w:val="9A9A9A"/>
@@ -1643,7 +1661,133 @@
                 <w:sz w:val="18"/>
                 <w:szCs w:val="18"/>
               </w:rPr>
-              <w:t xml:space="preserve">Where would you like to be in 6 months? Any numbers in mind?</w:t>
+              <w:t xml:space="preserve">Do you make money from your content now? How? (brand deals, affiliate, products, UGC, subscriptions)</w:t>
+            </w:r>
+          </w:p>
+        </w:tc>
+        <w:tc>
+          <w:tcPr>
+            <w:tcW w:type="dxa" w:w="6168"/>
+            <w:tcBorders>
+              <w:top w:val="single" w:color="BFBFBF" w:sz="4"/>
+              <w:left w:val="single" w:color="BFBFBF" w:sz="4"/>
+              <w:bottom w:val="single" w:color="BFBFBF" w:sz="4"/>
+              <w:right w:val="single" w:color="BFBFBF" w:sz="4"/>
+            </w:tcBorders>
+            <w:tcMar>
+              <w:top w:type="dxa" w:w="80"/>
+              <w:left w:type="dxa" w:w="120"/>
+              <w:bottom w:type="dxa" w:w="80"/>
+              <w:right w:type="dxa" w:w="120"/>
+            </w:tcMar>
+          </w:tcPr>
+          <w:p>
+            <w:pPr>
+              <w:spacing w:after="0" w:before="0"/>
+            </w:pPr>
+            <w:r>
+              <w:rPr>
+                <w:rFonts w:ascii="Arial" w:cs="Arial" w:eastAsia="Arial" w:hAnsi="Arial"/>
+                <w:sz w:val="21"/>
+                <w:szCs w:val="21"/>
+              </w:rPr>
+              <w:t xml:space="preserve"/>
+            </w:r>
+          </w:p>
+        </w:tc>
+      </w:tr>
+    </w:tbl>
+    <w:p>
+      <w:pPr>
+        <w:keepNext/>
+        <w:spacing w:after="60" w:before="280"/>
+      </w:pPr>
+      <w:r>
+        <w:rPr>
+          <w:rFonts w:ascii="Arial" w:cs="Arial" w:eastAsia="Arial" w:hAnsi="Arial"/>
+          <w:b/>
+          <w:bCs/>
+          <w:sz w:val="22"/>
+          <w:szCs w:val="22"/>
+        </w:rPr>
+        <w:t xml:space="preserve">5.  </w:t>
+      </w:r>
+      <w:r>
+        <w:rPr>
+          <w:rFonts w:ascii="Arial" w:cs="Arial" w:eastAsia="Arial" w:hAnsi="Arial"/>
+          <w:b/>
+          <w:bCs/>
+          <w:sz w:val="22"/>
+          <w:szCs w:val="22"/>
+        </w:rPr>
+        <w:t xml:space="preserve">How will we know it's working?</w:t>
+      </w:r>
+    </w:p>
+    <w:p>
+      <w:pPr>
+        <w:keepNext/>
+        <w:spacing w:after="80" w:before="0"/>
+      </w:pPr>
+      <w:r>
+        <w:rPr>
+          <w:rFonts w:ascii="Arial" w:cs="Arial" w:eastAsia="Arial" w:hAnsi="Arial"/>
+          <w:color w:val="6F6F6F"/>
+          <w:sz w:val="19"/>
+          <w:szCs w:val="19"/>
+        </w:rPr>
+        <w:t xml:space="preserve">Rough numbers are perfect. Knowing where you're starting lets us show you what's moved.</w:t>
+      </w:r>
+    </w:p>
+    <w:tbl>
+      <w:tblPr>
+        <w:tblW w:type="dxa" w:w="9638"/>
+        <w:tblBorders>
+          <w:top w:val="single" w:color="auto" w:sz="4"/>
+          <w:left w:val="single" w:color="auto" w:sz="4"/>
+          <w:bottom w:val="single" w:color="auto" w:sz="4"/>
+          <w:right w:val="single" w:color="auto" w:sz="4"/>
+          <w:insideH w:val="single" w:color="auto" w:sz="4"/>
+          <w:insideV w:val="single" w:color="auto" w:sz="4"/>
+        </w:tblBorders>
+      </w:tblPr>
+      <w:tblGrid>
+        <w:gridCol w:w="3470"/>
+        <w:gridCol w:w="6168"/>
+      </w:tblGrid>
+      <w:tr>
+        <w:trPr>
+          <w:cantSplit/>
+          <w:trHeight w:val="520" w:hRule="atLeast"/>
+        </w:trPr>
+        <w:tc>
+          <w:tcPr>
+            <w:tcW w:type="dxa" w:w="3470"/>
+            <w:tcBorders>
+              <w:top w:val="single" w:color="BFBFBF" w:sz="4"/>
+              <w:left w:val="single" w:color="BFBFBF" w:sz="4"/>
+              <w:bottom w:val="single" w:color="BFBFBF" w:sz="4"/>
+              <w:right w:val="single" w:color="BFBFBF" w:sz="4"/>
+            </w:tcBorders>
+            <w:shd w:fill="F2F2F2" w:color="auto" w:val="clear"/>
+            <w:tcMar>
+              <w:top w:type="dxa" w:w="80"/>
+              <w:left w:type="dxa" w:w="120"/>
+              <w:bottom w:type="dxa" w:w="80"/>
+              <w:right w:type="dxa" w:w="120"/>
+            </w:tcMar>
+          </w:tcPr>
+          <w:p>
+            <w:pPr>
+              <w:spacing w:after="0" w:before="0"/>
+            </w:pPr>
+            <w:r>
+              <w:rPr>
+                <w:rFonts w:ascii="Arial" w:cs="Arial" w:eastAsia="Arial" w:hAnsi="Arial"/>
+                <w:color w:val="6F6F6F"/>
+                <w:sz w:val="18"/>
+                <w:szCs w:val="18"/>
+              </w:rPr>
+              <w:t xml:space="preserve">What a win looks like in 3 months</w:t>
             </w:r>
           </w:p>
         </w:tc>
@@ -1681,7 +1825,7 @@
       <w:tr>
         <w:trPr>
           <w:cantSplit/>
-          <w:trHeight w:val="700" w:hRule="atLeast"/>
+          <w:trHeight w:val="520" w:hRule="atLeast"/>
         </w:trPr>
         <w:tc>
           <w:tcPr>
@@ -1711,7 +1855,75 @@
                 <w:sz w:val="18"/>
                 <w:szCs w:val="18"/>
               </w:rPr>
-              <w:t xml:space="preserve">Do you make money from your content now? How? (brand deals, affiliate, products, UGC, subscriptions)</w:t>
+              <w:t xml:space="preserve">How you'll measure it</w:t>
+            </w:r>
+          </w:p>
+        </w:tc>
+        <w:tc>
+          <w:tcPr>
+            <w:tcW w:type="dxa" w:w="6168"/>
+            <w:tcBorders>
+              <w:top w:val="single" w:color="BFBFBF" w:sz="4"/>
+              <w:left w:val="single" w:color="BFBFBF" w:sz="4"/>
+              <w:bottom w:val="single" w:color="BFBFBF" w:sz="4"/>
+              <w:right w:val="single" w:color="BFBFBF" w:sz="4"/>
+            </w:tcBorders>
+            <w:tcMar>
+              <w:top w:type="dxa" w:w="80"/>
+              <w:left w:type="dxa" w:w="120"/>
+              <w:bottom w:type="dxa" w:w="80"/>
+              <w:right w:type="dxa" w:w="120"/>
+            </w:tcMar>
+          </w:tcPr>
+          <w:p>
+            <w:pPr>
+              <w:spacing w:after="0" w:before="0"/>
+            </w:pPr>
+            <w:r>
+              <w:rPr>
+                <w:rFonts w:ascii="Arial" w:cs="Arial" w:eastAsia="Arial" w:hAnsi="Arial"/>
+                <w:sz w:val="21"/>
+                <w:szCs w:val="21"/>
+              </w:rPr>
+              <w:t xml:space="preserve"/>
+            </w:r>
+          </w:p>
+        </w:tc>
+      </w:tr>
+      <w:tr>
+        <w:trPr>
+          <w:cantSplit/>
+          <w:trHeight w:val="520" w:hRule="atLeast"/>
+        </w:trPr>
+        <w:tc>
+          <w:tcPr>
+            <w:tcW w:type="dxa" w:w="3470"/>
+            <w:tcBorders>
+              <w:top w:val="single" w:color="BFBFBF" w:sz="4"/>
+              <w:left w:val="single" w:color="BFBFBF" w:sz="4"/>
+              <w:bottom w:val="single" w:color="BFBFBF" w:sz="4"/>
+              <w:right w:val="single" w:color="BFBFBF" w:sz="4"/>
+            </w:tcBorders>
+            <w:shd w:fill="F2F2F2" w:color="auto" w:val="clear"/>
+            <w:tcMar>
+              <w:top w:type="dxa" w:w="80"/>
+              <w:left w:type="dxa" w:w="120"/>
+              <w:bottom w:type="dxa" w:w="80"/>
+              <w:right w:type="dxa" w:w="120"/>
+            </w:tcMar>
+          </w:tcPr>
+          <w:p>
+            <w:pPr>
+              <w:spacing w:after="0" w:before="0"/>
+            </w:pPr>
+            <w:r>
+              <w:rPr>
+                <w:rFonts w:ascii="Arial" w:cs="Arial" w:eastAsia="Arial" w:hAnsi="Arial"/>
+                <w:color w:val="6F6F6F"/>
+                <w:sz w:val="18"/>
+                <w:szCs w:val="18"/>
+              </w:rPr>
+              <w:t xml:space="preserve">Where that's at today</w:t>
             </w:r>
           </w:p>
         </w:tc>
@@ -1760,7 +1972,7 @@
           <w:sz w:val="22"/>
           <w:szCs w:val="22"/>
         </w:rPr>
-        <w:t xml:space="preserve">5.  </w:t>
+        <w:t xml:space="preserve">6.  </w:t>
       </w:r>
       <w:r>
         <w:rPr>
@@ -2431,7 +2643,7 @@
           <w:sz w:val="22"/>
           <w:szCs w:val="22"/>
         </w:rPr>
-        <w:t xml:space="preserve">6.  </w:t>
+        <w:t xml:space="preserve">7.  </w:t>
       </w:r>
       <w:r>
         <w:rPr>
@@ -2713,7 +2925,337 @@
           <w:sz w:val="22"/>
           <w:szCs w:val="22"/>
         </w:rPr>
-        <w:t xml:space="preserve">7.  </w:t>
+        <w:t xml:space="preserve">8.  </w:t>
+      </w:r>
+      <w:r>
+        <w:rPr>
+          <w:rFonts w:ascii="Arial" w:cs="Arial" w:eastAsia="Arial" w:hAnsi="Arial"/>
+          <w:b/>
+          <w:bCs/>
+          <w:sz w:val="22"/>
+          <w:szCs w:val="22"/>
+        </w:rPr>
+        <w:t xml:space="preserve">What do your insights say?</w:t>
+      </w:r>
+    </w:p>
+    <w:p>
+      <w:pPr>
+        <w:keepNext/>
+        <w:spacing w:after="80" w:before="0"/>
+      </w:pPr>
+      <w:r>
+        <w:rPr>
+          <w:rFonts w:ascii="Arial" w:cs="Arial" w:eastAsia="Arial" w:hAnsi="Arial"/>
+          <w:color w:val="6F6F6F"/>
+          <w:sz w:val="19"/>
+          <w:szCs w:val="19"/>
+        </w:rPr>
+        <w:t xml:space="preserve">From the insights or analytics tab on your main platform. Rough is fine, and you can share screenshots at the end.</w:t>
+      </w:r>
+    </w:p>
+    <w:tbl>
+      <w:tblPr>
+        <w:tblW w:type="dxa" w:w="9638"/>
+        <w:tblBorders>
+          <w:top w:val="single" w:color="auto" w:sz="4"/>
+          <w:left w:val="single" w:color="auto" w:sz="4"/>
+          <w:bottom w:val="single" w:color="auto" w:sz="4"/>
+          <w:right w:val="single" w:color="auto" w:sz="4"/>
+          <w:insideH w:val="single" w:color="auto" w:sz="4"/>
+          <w:insideV w:val="single" w:color="auto" w:sz="4"/>
+        </w:tblBorders>
+      </w:tblPr>
+      <w:tblGrid>
+        <w:gridCol w:w="3470"/>
+        <w:gridCol w:w="6168"/>
+      </w:tblGrid>
+      <w:tr>
+        <w:trPr>
+          <w:cantSplit/>
+          <w:trHeight w:val="520" w:hRule="atLeast"/>
+        </w:trPr>
+        <w:tc>
+          <w:tcPr>
+            <w:tcW w:type="dxa" w:w="3470"/>
+            <w:tcBorders>
+              <w:top w:val="single" w:color="BFBFBF" w:sz="4"/>
+              <w:left w:val="single" w:color="BFBFBF" w:sz="4"/>
+              <w:bottom w:val="single" w:color="BFBFBF" w:sz="4"/>
+              <w:right w:val="single" w:color="BFBFBF" w:sz="4"/>
+            </w:tcBorders>
+            <w:shd w:fill="F2F2F2" w:color="auto" w:val="clear"/>
+            <w:tcMar>
+              <w:top w:type="dxa" w:w="80"/>
+              <w:left w:type="dxa" w:w="120"/>
+              <w:bottom w:type="dxa" w:w="80"/>
+              <w:right w:type="dxa" w:w="120"/>
+            </w:tcMar>
+          </w:tcPr>
+          <w:p>
+            <w:pPr>
+              <w:spacing w:after="0" w:before="0"/>
+            </w:pPr>
+            <w:r>
+              <w:rPr>
+                <w:rFonts w:ascii="Arial" w:cs="Arial" w:eastAsia="Arial" w:hAnsi="Arial"/>
+                <w:color w:val="6F6F6F"/>
+                <w:sz w:val="18"/>
+                <w:szCs w:val="18"/>
+              </w:rPr>
+              <w:t xml:space="preserve">Main age range</w:t>
+            </w:r>
+          </w:p>
+        </w:tc>
+        <w:tc>
+          <w:tcPr>
+            <w:tcW w:type="dxa" w:w="6168"/>
+            <w:tcBorders>
+              <w:top w:val="single" w:color="BFBFBF" w:sz="4"/>
+              <w:left w:val="single" w:color="BFBFBF" w:sz="4"/>
+              <w:bottom w:val="single" w:color="BFBFBF" w:sz="4"/>
+              <w:right w:val="single" w:color="BFBFBF" w:sz="4"/>
+            </w:tcBorders>
+            <w:tcMar>
+              <w:top w:type="dxa" w:w="80"/>
+              <w:left w:type="dxa" w:w="120"/>
+              <w:bottom w:type="dxa" w:w="80"/>
+              <w:right w:type="dxa" w:w="120"/>
+            </w:tcMar>
+          </w:tcPr>
+          <w:p>
+            <w:pPr>
+              <w:spacing w:after="0" w:before="0"/>
+            </w:pPr>
+            <w:r>
+              <w:rPr>
+                <w:rFonts w:ascii="Arial" w:cs="Arial" w:eastAsia="Arial" w:hAnsi="Arial"/>
+                <w:sz w:val="21"/>
+                <w:szCs w:val="21"/>
+              </w:rPr>
+              <w:t xml:space="preserve"/>
+            </w:r>
+          </w:p>
+        </w:tc>
+      </w:tr>
+      <w:tr>
+        <w:trPr>
+          <w:cantSplit/>
+          <w:trHeight w:val="520" w:hRule="atLeast"/>
+        </w:trPr>
+        <w:tc>
+          <w:tcPr>
+            <w:tcW w:type="dxa" w:w="3470"/>
+            <w:tcBorders>
+              <w:top w:val="single" w:color="BFBFBF" w:sz="4"/>
+              <w:left w:val="single" w:color="BFBFBF" w:sz="4"/>
+              <w:bottom w:val="single" w:color="BFBFBF" w:sz="4"/>
+              <w:right w:val="single" w:color="BFBFBF" w:sz="4"/>
+            </w:tcBorders>
+            <w:shd w:fill="F2F2F2" w:color="auto" w:val="clear"/>
+            <w:tcMar>
+              <w:top w:type="dxa" w:w="80"/>
+              <w:left w:type="dxa" w:w="120"/>
+              <w:bottom w:type="dxa" w:w="80"/>
+              <w:right w:type="dxa" w:w="120"/>
+            </w:tcMar>
+          </w:tcPr>
+          <w:p>
+            <w:pPr>
+              <w:spacing w:after="0" w:before="0"/>
+            </w:pPr>
+            <w:r>
+              <w:rPr>
+                <w:rFonts w:ascii="Arial" w:cs="Arial" w:eastAsia="Arial" w:hAnsi="Arial"/>
+                <w:color w:val="6F6F6F"/>
+                <w:sz w:val="18"/>
+                <w:szCs w:val="18"/>
+              </w:rPr>
+              <w:t xml:space="preserve">Gender split</w:t>
+            </w:r>
+          </w:p>
+        </w:tc>
+        <w:tc>
+          <w:tcPr>
+            <w:tcW w:type="dxa" w:w="6168"/>
+            <w:tcBorders>
+              <w:top w:val="single" w:color="BFBFBF" w:sz="4"/>
+              <w:left w:val="single" w:color="BFBFBF" w:sz="4"/>
+              <w:bottom w:val="single" w:color="BFBFBF" w:sz="4"/>
+              <w:right w:val="single" w:color="BFBFBF" w:sz="4"/>
+            </w:tcBorders>
+            <w:tcMar>
+              <w:top w:type="dxa" w:w="80"/>
+              <w:left w:type="dxa" w:w="120"/>
+              <w:bottom w:type="dxa" w:w="80"/>
+              <w:right w:type="dxa" w:w="120"/>
+            </w:tcMar>
+          </w:tcPr>
+          <w:p>
+            <w:pPr>
+              <w:spacing w:after="0" w:before="0"/>
+            </w:pPr>
+            <w:r>
+              <w:rPr>
+                <w:rFonts w:ascii="Arial" w:cs="Arial" w:eastAsia="Arial" w:hAnsi="Arial"/>
+                <w:sz w:val="21"/>
+                <w:szCs w:val="21"/>
+              </w:rPr>
+              <w:t xml:space="preserve"/>
+            </w:r>
+          </w:p>
+        </w:tc>
+      </w:tr>
+      <w:tr>
+        <w:trPr>
+          <w:cantSplit/>
+          <w:trHeight w:val="520" w:hRule="atLeast"/>
+        </w:trPr>
+        <w:tc>
+          <w:tcPr>
+            <w:tcW w:type="dxa" w:w="3470"/>
+            <w:tcBorders>
+              <w:top w:val="single" w:color="BFBFBF" w:sz="4"/>
+              <w:left w:val="single" w:color="BFBFBF" w:sz="4"/>
+              <w:bottom w:val="single" w:color="BFBFBF" w:sz="4"/>
+              <w:right w:val="single" w:color="BFBFBF" w:sz="4"/>
+            </w:tcBorders>
+            <w:shd w:fill="F2F2F2" w:color="auto" w:val="clear"/>
+            <w:tcMar>
+              <w:top w:type="dxa" w:w="80"/>
+              <w:left w:type="dxa" w:w="120"/>
+              <w:bottom w:type="dxa" w:w="80"/>
+              <w:right w:type="dxa" w:w="120"/>
+            </w:tcMar>
+          </w:tcPr>
+          <w:p>
+            <w:pPr>
+              <w:spacing w:after="0" w:before="0"/>
+            </w:pPr>
+            <w:r>
+              <w:rPr>
+                <w:rFonts w:ascii="Arial" w:cs="Arial" w:eastAsia="Arial" w:hAnsi="Arial"/>
+                <w:color w:val="6F6F6F"/>
+                <w:sz w:val="18"/>
+                <w:szCs w:val="18"/>
+              </w:rPr>
+              <w:t xml:space="preserve">Top cities or countries</w:t>
+            </w:r>
+          </w:p>
+        </w:tc>
+        <w:tc>
+          <w:tcPr>
+            <w:tcW w:type="dxa" w:w="6168"/>
+            <w:tcBorders>
+              <w:top w:val="single" w:color="BFBFBF" w:sz="4"/>
+              <w:left w:val="single" w:color="BFBFBF" w:sz="4"/>
+              <w:bottom w:val="single" w:color="BFBFBF" w:sz="4"/>
+              <w:right w:val="single" w:color="BFBFBF" w:sz="4"/>
+            </w:tcBorders>
+            <w:tcMar>
+              <w:top w:type="dxa" w:w="80"/>
+              <w:left w:type="dxa" w:w="120"/>
+              <w:bottom w:type="dxa" w:w="80"/>
+              <w:right w:type="dxa" w:w="120"/>
+            </w:tcMar>
+          </w:tcPr>
+          <w:p>
+            <w:pPr>
+              <w:spacing w:after="0" w:before="0"/>
+            </w:pPr>
+            <w:r>
+              <w:rPr>
+                <w:rFonts w:ascii="Arial" w:cs="Arial" w:eastAsia="Arial" w:hAnsi="Arial"/>
+                <w:sz w:val="21"/>
+                <w:szCs w:val="21"/>
+              </w:rPr>
+              <w:t xml:space="preserve"/>
+            </w:r>
+          </w:p>
+        </w:tc>
+      </w:tr>
+      <w:tr>
+        <w:trPr>
+          <w:cantSplit/>
+          <w:trHeight w:val="520" w:hRule="atLeast"/>
+        </w:trPr>
+        <w:tc>
+          <w:tcPr>
+            <w:tcW w:type="dxa" w:w="3470"/>
+            <w:tcBorders>
+              <w:top w:val="single" w:color="BFBFBF" w:sz="4"/>
+              <w:left w:val="single" w:color="BFBFBF" w:sz="4"/>
+              <w:bottom w:val="single" w:color="BFBFBF" w:sz="4"/>
+              <w:right w:val="single" w:color="BFBFBF" w:sz="4"/>
+            </w:tcBorders>
+            <w:shd w:fill="F2F2F2" w:color="auto" w:val="clear"/>
+            <w:tcMar>
+              <w:top w:type="dxa" w:w="80"/>
+              <w:left w:type="dxa" w:w="120"/>
+              <w:bottom w:type="dxa" w:w="80"/>
+              <w:right w:type="dxa" w:w="120"/>
+            </w:tcMar>
+          </w:tcPr>
+          <w:p>
+            <w:pPr>
+              <w:spacing w:after="0" w:before="0"/>
+            </w:pPr>
+            <w:r>
+              <w:rPr>
+                <w:rFonts w:ascii="Arial" w:cs="Arial" w:eastAsia="Arial" w:hAnsi="Arial"/>
+                <w:color w:val="6F6F6F"/>
+                <w:sz w:val="18"/>
+                <w:szCs w:val="18"/>
+              </w:rPr>
+              <w:t xml:space="preserve">Average watch time on a normal post</w:t>
+            </w:r>
+          </w:p>
+        </w:tc>
+        <w:tc>
+          <w:tcPr>
+            <w:tcW w:type="dxa" w:w="6168"/>
+            <w:tcBorders>
+              <w:top w:val="single" w:color="BFBFBF" w:sz="4"/>
+              <w:left w:val="single" w:color="BFBFBF" w:sz="4"/>
+              <w:bottom w:val="single" w:color="BFBFBF" w:sz="4"/>
+              <w:right w:val="single" w:color="BFBFBF" w:sz="4"/>
+            </w:tcBorders>
+            <w:tcMar>
+              <w:top w:type="dxa" w:w="80"/>
+              <w:left w:type="dxa" w:w="120"/>
+              <w:bottom w:type="dxa" w:w="80"/>
+              <w:right w:type="dxa" w:w="120"/>
+            </w:tcMar>
+          </w:tcPr>
+          <w:p>
+            <w:pPr>
+              <w:spacing w:after="0" w:before="0"/>
+            </w:pPr>
+            <w:r>
+              <w:rPr>
+                <w:rFonts w:ascii="Arial" w:cs="Arial" w:eastAsia="Arial" w:hAnsi="Arial"/>
+                <w:sz w:val="21"/>
+                <w:szCs w:val="21"/>
+              </w:rPr>
+              <w:t xml:space="preserve"/>
+            </w:r>
+          </w:p>
+        </w:tc>
+      </w:tr>
+    </w:tbl>
+    <w:p>
+      <w:pPr>
+        <w:keepNext/>
+        <w:spacing w:after="60" w:before="280"/>
+      </w:pPr>
+      <w:r>
+        <w:rPr>
+          <w:rFonts w:ascii="Arial" w:cs="Arial" w:eastAsia="Arial" w:hAnsi="Arial"/>
+          <w:b/>
+          <w:bCs/>
+          <w:sz w:val="22"/>
+          <w:szCs w:val="22"/>
+        </w:rPr>
+        <w:t xml:space="preserve">9.  </w:t>
       </w:r>
       <w:r>
         <w:rPr>
@@ -2851,7 +3393,7 @@
           <w:sz w:val="22"/>
           <w:szCs w:val="22"/>
         </w:rPr>
-        <w:t xml:space="preserve">8.  </w:t>
+        <w:t xml:space="preserve">10.  </w:t>
       </w:r>
       <w:r>
         <w:rPr>
@@ -3065,7 +3607,7 @@
           <w:sz w:val="22"/>
           <w:szCs w:val="22"/>
         </w:rPr>
-        <w:t xml:space="preserve">9.  </w:t>
+        <w:t xml:space="preserve">11.  </w:t>
       </w:r>
       <w:r>
         <w:rPr>
@@ -3347,7 +3889,7 @@
           <w:sz w:val="22"/>
           <w:szCs w:val="22"/>
         </w:rPr>
-        <w:t xml:space="preserve">10.  </w:t>
+        <w:t xml:space="preserve">12.  </w:t>
       </w:r>
       <w:r>
         <w:rPr>
@@ -3614,7 +4156,7 @@
           <w:sz w:val="22"/>
           <w:szCs w:val="22"/>
         </w:rPr>
-        <w:t xml:space="preserve">11.  </w:t>
+        <w:t xml:space="preserve">13.  </w:t>
       </w:r>
       <w:r>
         <w:rPr>
@@ -3724,7 +4266,7 @@
           <w:sz w:val="22"/>
           <w:szCs w:val="22"/>
         </w:rPr>
-        <w:t xml:space="preserve">12.  </w:t>
+        <w:t xml:space="preserve">14.  </w:t>
       </w:r>
       <w:r>
         <w:rPr>
@@ -3862,7 +4404,7 @@
           <w:sz w:val="22"/>
           <w:szCs w:val="22"/>
         </w:rPr>
-        <w:t xml:space="preserve">13.  </w:t>
+        <w:t xml:space="preserve">15.  </w:t>
       </w:r>
       <w:r>
         <w:rPr>
@@ -4573,7 +5115,7 @@
           <w:sz w:val="22"/>
           <w:szCs w:val="22"/>
         </w:rPr>
-        <w:t xml:space="preserve">14.  </w:t>
+        <w:t xml:space="preserve">16.  </w:t>
       </w:r>
       <w:r>
         <w:rPr>
@@ -4815,7 +5357,7 @@
           <w:sz w:val="22"/>
           <w:szCs w:val="22"/>
         </w:rPr>
-        <w:t xml:space="preserve">15.  </w:t>
+        <w:t xml:space="preserve">17.  </w:t>
       </w:r>
       <w:r>
         <w:rPr>
@@ -5199,7 +5741,7 @@
           <w:sz w:val="22"/>
           <w:szCs w:val="22"/>
         </w:rPr>
-        <w:t xml:space="preserve">16.  </w:t>
+        <w:t xml:space="preserve">18.  </w:t>
       </w:r>
       <w:r>
         <w:rPr>
@@ -5413,7 +5955,7 @@
           <w:sz w:val="22"/>
           <w:szCs w:val="22"/>
         </w:rPr>
-        <w:t xml:space="preserve">17.  </w:t>
+        <w:t xml:space="preserve">19.  </w:t>
       </w:r>
       <w:r>
         <w:rPr>
@@ -5523,7 +6065,7 @@
           <w:sz w:val="22"/>
           <w:szCs w:val="22"/>
         </w:rPr>
-        <w:t xml:space="preserve">18.  </w:t>
+        <w:t xml:space="preserve">20.  </w:t>
       </w:r>
       <w:r>
         <w:rPr>
@@ -5661,7 +6203,7 @@
           <w:sz w:val="22"/>
           <w:szCs w:val="22"/>
         </w:rPr>
-        <w:t xml:space="preserve">19.  </w:t>
+        <w:t xml:space="preserve">21.  </w:t>
       </w:r>
       <w:r>
         <w:rPr>
@@ -5959,7 +6501,7 @@
           <w:sz w:val="22"/>
           <w:szCs w:val="22"/>
         </w:rPr>
-        <w:t xml:space="preserve">20.  </w:t>
+        <w:t xml:space="preserve">22.  </w:t>
       </w:r>
       <w:r>
         <w:rPr>
@@ -6190,7 +6732,7 @@
           <w:sz w:val="22"/>
           <w:szCs w:val="22"/>
         </w:rPr>
-        <w:t xml:space="preserve">21.  </w:t>
+        <w:t xml:space="preserve">23.  </w:t>
       </w:r>
       <w:r>
         <w:rPr>
@@ -6330,7 +6872,7 @@
           <w:sz w:val="22"/>
           <w:szCs w:val="22"/>
         </w:rPr>
-        <w:t xml:space="preserve">22.  </w:t>
+        <w:t xml:space="preserve">24.  </w:t>
       </w:r>
       <w:r>
         <w:rPr>
@@ -6474,6 +7016,200 @@
         <w:tc>
           <w:tcPr>
             <w:tcW w:type="dxa" w:w="9638"/>
+            <w:tcBorders>
+              <w:top w:val="single" w:color="BFBFBF" w:sz="4"/>
+              <w:left w:val="single" w:color="BFBFBF" w:sz="4"/>
+              <w:bottom w:val="single" w:color="BFBFBF" w:sz="4"/>
+              <w:right w:val="single" w:color="BFBFBF" w:sz="4"/>
+            </w:tcBorders>
+            <w:tcMar>
+              <w:top w:type="dxa" w:w="80"/>
+              <w:left w:type="dxa" w:w="120"/>
+              <w:bottom w:type="dxa" w:w="80"/>
+              <w:right w:type="dxa" w:w="120"/>
+            </w:tcMar>
+          </w:tcPr>
+          <w:p>
+            <w:pPr>
+              <w:spacing w:after="0" w:before="0"/>
+            </w:pPr>
+            <w:r>
+              <w:rPr>
+                <w:rFonts w:ascii="Arial" w:cs="Arial" w:eastAsia="Arial" w:hAnsi="Arial"/>
+                <w:sz w:val="21"/>
+                <w:szCs w:val="21"/>
+              </w:rPr>
+              <w:t xml:space="preserve"/>
+            </w:r>
+          </w:p>
+        </w:tc>
+      </w:tr>
+    </w:tbl>
+    <w:p>
+      <w:pPr>
+        <w:keepNext/>
+        <w:spacing w:after="60" w:before="280"/>
+      </w:pPr>
+      <w:r>
+        <w:rPr>
+          <w:rFonts w:ascii="Arial" w:cs="Arial" w:eastAsia="Arial" w:hAnsi="Arial"/>
+          <w:b/>
+          <w:bCs/>
+          <w:sz w:val="22"/>
+          <w:szCs w:val="22"/>
+        </w:rPr>
+        <w:t xml:space="preserve">25.  </w:t>
+      </w:r>
+      <w:r>
+        <w:rPr>
+          <w:rFonts w:ascii="Arial" w:cs="Arial" w:eastAsia="Arial" w:hAnsi="Arial"/>
+          <w:b/>
+          <w:bCs/>
+          <w:sz w:val="22"/>
+          <w:szCs w:val="22"/>
+        </w:rPr>
+        <w:t xml:space="preserve">Got files to share?</w:t>
+      </w:r>
+    </w:p>
+    <w:p>
+      <w:pPr>
+        <w:keepNext/>
+        <w:spacing w:after="80" w:before="0"/>
+      </w:pPr>
+      <w:r>
+        <w:rPr>
+          <w:rFonts w:ascii="Arial" w:cs="Arial" w:eastAsia="Arial" w:hAnsi="Arial"/>
+          <w:color w:val="6F6F6F"/>
+          <w:sz w:val="19"/>
+          <w:szCs w:val="19"/>
+        </w:rPr>
+        <w:t xml:space="preserve">Put them in a shared folder and paste the link. Most useful: screenshots of your insights (audience, top posts, watch time), plus any brand kit, media kit or past videos you love.</w:t>
+      </w:r>
+    </w:p>
+    <w:tbl>
+      <w:tblPr>
+        <w:tblW w:type="dxa" w:w="9638"/>
+        <w:tblBorders>
+          <w:top w:val="single" w:color="auto" w:sz="4"/>
+          <w:left w:val="single" w:color="auto" w:sz="4"/>
+          <w:bottom w:val="single" w:color="auto" w:sz="4"/>
+          <w:right w:val="single" w:color="auto" w:sz="4"/>
+          <w:insideH w:val="single" w:color="auto" w:sz="4"/>
+          <w:insideV w:val="single" w:color="auto" w:sz="4"/>
+        </w:tblBorders>
+      </w:tblPr>
+      <w:tblGrid>
+        <w:gridCol w:w="3470"/>
+        <w:gridCol w:w="6168"/>
+      </w:tblGrid>
+      <w:tr>
+        <w:trPr>
+          <w:cantSplit/>
+          <w:trHeight w:val="520" w:hRule="atLeast"/>
+        </w:trPr>
+        <w:tc>
+          <w:tcPr>
+            <w:tcW w:type="dxa" w:w="3470"/>
+            <w:tcBorders>
+              <w:top w:val="single" w:color="BFBFBF" w:sz="4"/>
+              <w:left w:val="single" w:color="BFBFBF" w:sz="4"/>
+              <w:bottom w:val="single" w:color="BFBFBF" w:sz="4"/>
+              <w:right w:val="single" w:color="BFBFBF" w:sz="4"/>
+            </w:tcBorders>
+            <w:shd w:fill="F2F2F2" w:color="auto" w:val="clear"/>
+            <w:tcMar>
+              <w:top w:type="dxa" w:w="80"/>
+              <w:left w:type="dxa" w:w="120"/>
+              <w:bottom w:type="dxa" w:w="80"/>
+              <w:right w:type="dxa" w:w="120"/>
+            </w:tcMar>
+          </w:tcPr>
+          <w:p>
+            <w:pPr>
+              <w:spacing w:after="0" w:before="0"/>
+            </w:pPr>
+            <w:r>
+              <w:rPr>
+                <w:rFonts w:ascii="Arial" w:cs="Arial" w:eastAsia="Arial" w:hAnsi="Arial"/>
+                <w:color w:val="6F6F6F"/>
+                <w:sz w:val="18"/>
+                <w:szCs w:val="18"/>
+              </w:rPr>
+              <w:t xml:space="preserve">Google Drive or Dropbox folder link</w:t>
+            </w:r>
+          </w:p>
+        </w:tc>
+        <w:tc>
+          <w:tcPr>
+            <w:tcW w:type="dxa" w:w="6168"/>
+            <w:tcBorders>
+              <w:top w:val="single" w:color="BFBFBF" w:sz="4"/>
+              <w:left w:val="single" w:color="BFBFBF" w:sz="4"/>
+              <w:bottom w:val="single" w:color="BFBFBF" w:sz="4"/>
+              <w:right w:val="single" w:color="BFBFBF" w:sz="4"/>
+            </w:tcBorders>
+            <w:tcMar>
+              <w:top w:type="dxa" w:w="80"/>
+              <w:left w:type="dxa" w:w="120"/>
+              <w:bottom w:type="dxa" w:w="80"/>
+              <w:right w:type="dxa" w:w="120"/>
+            </w:tcMar>
+          </w:tcPr>
+          <w:p>
+            <w:pPr>
+              <w:spacing w:after="0" w:before="0"/>
+            </w:pPr>
+            <w:r>
+              <w:rPr>
+                <w:rFonts w:ascii="Arial" w:cs="Arial" w:eastAsia="Arial" w:hAnsi="Arial"/>
+                <w:sz w:val="21"/>
+                <w:szCs w:val="21"/>
+              </w:rPr>
+              <w:t xml:space="preserve"/>
+            </w:r>
+          </w:p>
+        </w:tc>
+      </w:tr>
+      <w:tr>
+        <w:trPr>
+          <w:cantSplit/>
+          <w:trHeight w:val="520" w:hRule="atLeast"/>
+        </w:trPr>
+        <w:tc>
+          <w:tcPr>
+            <w:tcW w:type="dxa" w:w="3470"/>
+            <w:tcBorders>
+              <w:top w:val="single" w:color="BFBFBF" w:sz="4"/>
+              <w:left w:val="single" w:color="BFBFBF" w:sz="4"/>
+              <w:bottom w:val="single" w:color="BFBFBF" w:sz="4"/>
+              <w:right w:val="single" w:color="BFBFBF" w:sz="4"/>
+            </w:tcBorders>
+            <w:shd w:fill="F2F2F2" w:color="auto" w:val="clear"/>
+            <w:tcMar>
+              <w:top w:type="dxa" w:w="80"/>
+              <w:left w:type="dxa" w:w="120"/>
+              <w:bottom w:type="dxa" w:w="80"/>
+              <w:right w:type="dxa" w:w="120"/>
+            </w:tcMar>
+          </w:tcPr>
+          <w:p>
+            <w:pPr>
+              <w:spacing w:after="0" w:before="0"/>
+            </w:pPr>
+            <w:r>
+              <w:rPr>
+                <w:rFonts w:ascii="Arial" w:cs="Arial" w:eastAsia="Arial" w:hAnsi="Arial"/>
+                <w:color w:val="6F6F6F"/>
+                <w:sz w:val="18"/>
+                <w:szCs w:val="18"/>
+              </w:rPr>
+              <w:t xml:space="preserve">What's in there</w:t>
+            </w:r>
+          </w:p>
+        </w:tc>
+        <w:tc>
+          <w:tcPr>
+            <w:tcW w:type="dxa" w:w="6168"/>
             <w:tcBorders>
               <w:top w:val="single" w:color="BFBFBF" w:sz="4"/>
               <w:left w:val="single" w:color="BFBFBF" w:sz="4"/>

</xml_diff>